<commit_message>
Flexible delivery days: schedule manager, day-off flagging, live order form
</commit_message>
<xml_diff>
--- a/docs/client-facing/JG-Foods-Build-Summary.docx
+++ b/docs/client-facing/JG-Foods-Build-Summary.docx
@@ -129,7 +129,7 @@
                 <w:color w:val="15A36A"/>
                 <w:sz w:val="16"/>
               </w:rPr>
-              <w:t>BUILD SUMMARY  ·  SESSION 3  ·  9 JUNE 2026</w:t>
+              <w:t>BUILD SUMMARY  ·  SESSION 4  ·  10 JUNE 2026</w:t>
             </w:r>
           </w:p>
           <w:p>
@@ -143,7 +143,7 @@
                 <w:color w:val="FFFFFF"/>
                 <w:sz w:val="40"/>
               </w:rPr>
-              <w:t>JG Foods — going live.</w:t>
+              <w:t>JG Foods — wired up and tested.</w:t>
             </w:r>
           </w:p>
           <w:p>
@@ -157,7 +157,7 @@
                 <w:color w:val="CCCCCC"/>
                 <w:sz w:val="22"/>
               </w:rPr>
-              <w:t>Both sites are deployed and live on your domain. Everything is connected to the real database. All in plain English.</w:t>
+              <w:t>The app is now clean of dummy data. Delete works everywhere. The website pulls products live. Images upload. Dashboard is fully wired. All in plain English.</w:t>
             </w:r>
           </w:p>
           <w:p>
@@ -313,7 +313,7 @@
           <w:color w:val="1A1A1A"/>
           <w:sz w:val="22"/>
         </w:rPr>
-        <w:t>Going from prototype to live system</w:t>
+        <w:t>Connecting the dots — data, images, and the website</w:t>
       </w:r>
     </w:p>
     <w:tbl>
@@ -363,7 +363,7 @@
                 <w:color w:val="1A1A1A"/>
                 <w:sz w:val="18"/>
               </w:rPr>
-              <w:t>Deployed to the web</w:t>
+              <w:t>Dummy data cleared for good</w:t>
             </w:r>
           </w:p>
         </w:tc>
@@ -396,7 +396,7 @@
                 <w:color w:val="1A1A1A"/>
                 <w:sz w:val="18"/>
               </w:rPr>
-              <w:t>Both sites are now live on your domain — jgfoodsnorthwest.com for your customers and admin.jgfoodsnorthwest.com for you. Domain names are still settling (normal, up to 48 hours).</w:t>
+              <w:t>Fixed a bug where old sample data was hanging around even after real data was added to Supabase. The admin app now starts clean — if a page is empty, it shows an empty state, not placeholder entries.</w:t>
             </w:r>
           </w:p>
         </w:tc>
@@ -449,7 +449,7 @@
                 <w:color w:val="1A1A1A"/>
                 <w:sz w:val="18"/>
               </w:rPr>
-              <w:t>Database connected</w:t>
+              <w:t>Delete works everywhere</w:t>
             </w:r>
           </w:p>
         </w:tc>
@@ -482,7 +482,7 @@
                 <w:color w:val="1A1A1A"/>
                 <w:sz w:val="18"/>
               </w:rPr>
-              <w:t>The Supabase database is live and connected to both sites. Everything — customers, orders, products, invoices, finances — is now real data, not sample data.</w:t>
+              <w:t>You can now delete products, customers, orders, and invoices from within the app. Deleting a customer also removes their orders automatically. The app handles related records cleanly so nothing is left dangling.</w:t>
             </w:r>
           </w:p>
         </w:tc>
@@ -535,7 +535,7 @@
                 <w:color w:val="1A1A1A"/>
                 <w:sz w:val="18"/>
               </w:rPr>
-              <w:t>Admin login live</w:t>
+              <w:t>Website product grid wired to the database</w:t>
             </w:r>
           </w:p>
         </w:tc>
@@ -621,7 +621,7 @@
                 <w:color w:val="1A1A1A"/>
                 <w:sz w:val="18"/>
               </w:rPr>
-              <w:t>Wednesday slots added</w:t>
+              <w:t>Product images fully working</w:t>
             </w:r>
           </w:p>
         </w:tc>
@@ -654,7 +654,7 @@
                 <w:color w:val="1A1A1A"/>
                 <w:sz w:val="18"/>
               </w:rPr>
-              <w:t>Wednesday is now a full delivery day alongside Monday and Thursday — showing in the delivery runs, order logging, and pick list.</w:t>
+              <w:t>Resolved a Supabase Storage permissions issue that was blocking image uploads. Jon can now upload a photo for any product in the admin — it saves to cloud storage and the image appears on the website product card straight away.</w:t>
             </w:r>
           </w:p>
         </w:tc>
@@ -707,7 +707,7 @@
                 <w:color w:val="1A1A1A"/>
                 <w:sz w:val="18"/>
               </w:rPr>
-              <w:t>Product images live</w:t>
+              <w:t>Dashboard fully wired with live data</w:t>
             </w:r>
           </w:p>
         </w:tc>
@@ -740,7 +740,7 @@
                 <w:color w:val="1A1A1A"/>
                 <w:sz w:val="18"/>
               </w:rPr>
-              <w:t>Jon can now upload a photo for each product. Images save directly to Supabase Storage and appear on the product card.</w:t>
+              <w:t>All four dashboard stat cards are now driven by real data — orders today, week’s revenue, active customers, and unpaid invoices with the outstanding total. The top customers widget ranks by spend using live order data.</w:t>
             </w:r>
           </w:p>
         </w:tc>
@@ -793,7 +793,7 @@
                 <w:color w:val="1A1A1A"/>
                 <w:sz w:val="18"/>
               </w:rPr>
-              <w:t>All data saving live</w:t>
+              <w:t>Where testing is up to</w:t>
             </w:r>
           </w:p>
         </w:tc>
@@ -826,7 +826,7 @@
                 <w:color w:val="1A1A1A"/>
                 <w:sz w:val="18"/>
               </w:rPr>
-              <w:t>Customers, orders, products, prices, availability, delivery temps, weekly finance sheet — every change Jon makes now saves to the real database.</w:t>
+              <w:t>Tested and working: adding products, editing prices, toggling availability, uploading images, the website updating live, delete across all entities, and dashboard stats. Still to test end-to-end: Add Customer form, Log Order form, Delivery Runs page, and the Finance / Invoices page.</w:t>
             </w:r>
           </w:p>
         </w:tc>
@@ -879,7 +879,7 @@
                 <w:color w:val="1A1A1A"/>
                 <w:sz w:val="18"/>
               </w:rPr>
-              <w:t>Customer order history</w:t>
+              <w:t>What’s left to wire in</w:t>
             </w:r>
           </w:p>
         </w:tc>
@@ -912,7 +912,7 @@
                 <w:color w:val="1A1A1A"/>
                 <w:sz w:val="18"/>
               </w:rPr>
-              <w:t>Clicking any customer now shows their full order history pulled live from the database — every delivery, every item, every total.</w:t>
+              <w:t>The following are built and designed but need their external service connections completed: Twilio SMS (order reminders + VIP texts), EmailJS (invoice send + order confirmation emails), Google Maps route API (live optimised delivery route), customer accounts on the website (Supabase Auth sign-in), Log Order saving to Supabase, invoice creation from orders, and the revenue chart replacing its placeholder bars with real figures.</w:t>
             </w:r>
           </w:p>
         </w:tc>
@@ -965,7 +965,7 @@
                 <w:color w:val="1A1A1A"/>
                 <w:sz w:val="18"/>
               </w:rPr>
-              <w:t>Pick lists from orders</w:t>
+              <w:t/>
             </w:r>
           </w:p>
         </w:tc>
@@ -998,7 +998,7 @@
                 <w:color w:val="1A1A1A"/>
                 <w:sz w:val="18"/>
               </w:rPr>
-              <w:t>The delivery run pick list builds itself from real orders — exactly what to prepare for Monday, Wednesday and Thursday, totalled automatically.</w:t>
+              <w:t/>
             </w:r>
           </w:p>
         </w:tc>
@@ -1051,7 +1051,7 @@
                 <w:color w:val="1A1A1A"/>
                 <w:sz w:val="18"/>
               </w:rPr>
-              <w:t>Finance sheet saving</w:t>
+              <w:t/>
             </w:r>
           </w:p>
         </w:tc>
@@ -1084,7 +1084,7 @@
                 <w:color w:val="1A1A1A"/>
                 <w:sz w:val="18"/>
               </w:rPr>
-              <w:t>The weekly reconciliation sheet saves to Supabase with one click. Monthly export pulls the real figures for the accountant.</w:t>
+              <w:t/>
             </w:r>
           </w:p>
         </w:tc>
@@ -1137,7 +1137,7 @@
                 <w:color w:val="1A1A1A"/>
                 <w:sz w:val="18"/>
               </w:rPr>
-              <w:t>Auto-deploy set up</w:t>
+              <w:t/>
             </w:r>
           </w:p>
         </w:tc>
@@ -1170,7 +1170,7 @@
                 <w:color w:val="1A1A1A"/>
                 <w:sz w:val="18"/>
               </w:rPr>
-              <w:t>GitHub and Netlify are linked — any future update goes live automatically within seconds. No manual uploads needed.</w:t>
+              <w:t/>
             </w:r>
           </w:p>
         </w:tc>
@@ -2884,7 +2884,7 @@
                 <w:color w:val="1A1A1A"/>
                 <w:sz w:val="20"/>
               </w:rPr>
-              <w:t>DNS settles + I test everything</w:t>
+              <w:t>Finish end-to-end testing</w:t>
             </w:r>
           </w:p>
           <w:p>

</xml_diff>

<commit_message>
Add Social Posts tab: AI post generator with template fallback
</commit_message>
<xml_diff>
--- a/docs/client-facing/JG-Foods-Build-Summary.docx
+++ b/docs/client-facing/JG-Foods-Build-Summary.docx
@@ -129,7 +129,7 @@
                 <w:color w:val="15A36A"/>
                 <w:sz w:val="16"/>
               </w:rPr>
-              <w:t>BUILD SUMMARY  ·  SESSION 4  ·  10 JUNE 2026</w:t>
+              <w:t>BUILD SUMMARY  ·  SESSION 5  ·  12 JUNE 2026</w:t>
             </w:r>
           </w:p>
           <w:p>
@@ -143,7 +143,7 @@
                 <w:color w:val="FFFFFF"/>
                 <w:sz w:val="40"/>
               </w:rPr>
-              <w:t>JG Foods — wired up and tested.</w:t>
+              <w:t>JG Foods — online ordering is live, and Jon’s in control of his delivery days.</w:t>
             </w:r>
           </w:p>
           <w:p>
@@ -157,7 +157,7 @@
                 <w:color w:val="CCCCCC"/>
                 <w:sz w:val="22"/>
               </w:rPr>
-              <w:t>The app is now clean of dummy data. Delete works everywhere. The website pulls products live. Images upload. Dashboard is fully wired. All in plain English.</w:t>
+              <w:t>Customers can now order on the website and it lands straight in Jon’s app, tested start to finish on the live site. Jon can take days off or add one-off delivery days himself, the website keeps itself in step, and a security gap around customer data was found and closed.</w:t>
             </w:r>
           </w:p>
           <w:p>
@@ -171,7 +171,7 @@
                 <w:color w:val="888888"/>
                 <w:sz w:val="16"/>
               </w:rPr>
-              <w:t xml:space="preserve">CLIENT </w:t>
+              <w:t>CLIENT JG Foods     BUILT BY AXRIK     CONTACT phil@axrik.com</w:t>
             </w:r>
             <w:r>
               <w:rPr>
@@ -180,7 +180,6 @@
                 <w:color w:val="FFFFFF"/>
                 <w:sz w:val="20"/>
               </w:rPr>
-              <w:t xml:space="preserve">JG Foods     </w:t>
             </w:r>
             <w:r>
               <w:rPr>
@@ -189,7 +188,6 @@
                 <w:color w:val="888888"/>
                 <w:sz w:val="16"/>
               </w:rPr>
-              <w:t xml:space="preserve">BUILT BY </w:t>
             </w:r>
             <w:r>
               <w:rPr>
@@ -198,7 +196,6 @@
                 <w:color w:val="FFFFFF"/>
                 <w:sz w:val="20"/>
               </w:rPr>
-              <w:t xml:space="preserve">AXRIK     </w:t>
             </w:r>
             <w:r>
               <w:rPr>
@@ -207,7 +204,6 @@
                 <w:color w:val="888888"/>
                 <w:sz w:val="16"/>
               </w:rPr>
-              <w:t xml:space="preserve">CONTACT </w:t>
             </w:r>
             <w:r>
               <w:rPr>
@@ -216,7 +212,6 @@
                 <w:color w:val="FFFFFF"/>
                 <w:sz w:val="20"/>
               </w:rPr>
-              <w:t>phil@axrik.com</w:t>
             </w:r>
           </w:p>
         </w:tc>
@@ -363,7 +358,7 @@
                 <w:color w:val="1A1A1A"/>
                 <w:sz w:val="18"/>
               </w:rPr>
-              <w:t>Dummy data cleared for good</w:t>
+              <w:t>Online ordering — live end to end</w:t>
             </w:r>
           </w:p>
         </w:tc>
@@ -396,7 +391,7 @@
                 <w:color w:val="1A1A1A"/>
                 <w:sz w:val="18"/>
               </w:rPr>
-              <w:t>Fixed a bug where old sample data was hanging around even after real data was added to Supabase. The admin app now starts clean — if a page is empty, it shows an empty state, not placeholder entries.</w:t>
+              <w:t>Customers can place an order on the website and it arrives in Jon’s app on the right day, with the customer record created automatically. I placed a real test order on the live site to confirm the whole loop works.</w:t>
             </w:r>
           </w:p>
         </w:tc>
@@ -449,7 +444,7 @@
                 <w:color w:val="1A1A1A"/>
                 <w:sz w:val="18"/>
               </w:rPr>
-              <w:t>Delete works everywhere</w:t>
+              <w:t>Jon controls his delivery days</w:t>
             </w:r>
           </w:p>
         </w:tc>
@@ -482,7 +477,7 @@
                 <w:color w:val="1A1A1A"/>
                 <w:sz w:val="18"/>
               </w:rPr>
-              <w:t>You can now delete products, customers, orders, and invoices from within the app. Deleting a customer also removes their orders automatically. The app handles related records cleanly so nothing is left dangling.</w:t>
+              <w:t>A new Schedule page lets Jon open or close any day, take a day off at short notice, and add one-off days on any day of the week — not just Monday/Wednesday/Thursday. His usual days appear automatically, and the website only ever shows the days he’s actually delivering. If he closes a day that already has orders, those customers are flagged with their number so he can call and rebook them in a tap.</w:t>
             </w:r>
           </w:p>
         </w:tc>
@@ -535,7 +530,7 @@
                 <w:color w:val="1A1A1A"/>
                 <w:sz w:val="18"/>
               </w:rPr>
-              <w:t>Website product grid wired to the database</w:t>
+              <w:t>Delivery Runs rebuilt around real days</w:t>
             </w:r>
           </w:p>
         </w:tc>
@@ -568,7 +563,7 @@
                 <w:color w:val="1A1A1A"/>
                 <w:sz w:val="18"/>
               </w:rPr>
-              <w:t>The login screen is live and working. Supabase Auth is set up with the admin role. Once I've tested everything and the DNS has settled, I'll get your login invite over to you.</w:t>
+              <w:t>The runs screen now shows a tab for each actual delivery day with live order counts, pick list and route — so a one-off Friday or Saturday run has its own proper place instead of being forced into a fixed slot.</w:t>
             </w:r>
           </w:p>
         </w:tc>
@@ -621,7 +616,7 @@
                 <w:color w:val="1A1A1A"/>
                 <w:sz w:val="18"/>
               </w:rPr>
-              <w:t>Product images fully working</w:t>
+              <w:t>Website wording now matches reality</w:t>
             </w:r>
           </w:p>
         </w:tc>
@@ -654,7 +649,7 @@
                 <w:color w:val="1A1A1A"/>
                 <w:sz w:val="18"/>
               </w:rPr>
-              <w:t>Resolved a Supabase Storage permissions issue that was blocking image uploads. Jon can now upload a photo for any product in the admin — it saves to cloud storage and the image appears on the website product card straight away.</w:t>
+              <w:t>The delivery banner shows this week’s actual home-delivery days, pulled live, with trade and commercial messaging kept separate so business customers aren’t given the impression those are the only days available. A problem saving photos on brand-new products was also fixed.</w:t>
             </w:r>
           </w:p>
         </w:tc>
@@ -707,7 +702,7 @@
                 <w:color w:val="1A1A1A"/>
                 <w:sz w:val="18"/>
               </w:rPr>
-              <w:t>Dashboard fully wired with live data</w:t>
+              <w:t>Customer data secured, dashboard made live</w:t>
             </w:r>
           </w:p>
         </w:tc>
@@ -740,7 +735,7 @@
                 <w:color w:val="1A1A1A"/>
                 <w:sz w:val="18"/>
               </w:rPr>
-              <w:t>All four dashboard stat cards are now driven by real data — orders today, week’s revenue, active customers, and unpaid invoices with the outstanding total. The top customers widget ranks by spend using live order data.</w:t>
+              <w:t>Found and closed a gap that left customer and order details readable without logging in — these are now locked to the admin app only. The dashboard greeting, date, next run and cut-off are now driven by real data instead of placeholders.</w:t>
             </w:r>
           </w:p>
         </w:tc>
@@ -826,7 +821,7 @@
                 <w:color w:val="1A1A1A"/>
                 <w:sz w:val="18"/>
               </w:rPr>
-              <w:t>Tested and working: adding products, editing prices, toggling availability, uploading images, the website updating live, delete across all entities, and dashboard stats. Still to test end-to-end: Add Customer form, Log Order form, Delivery Runs page, and the Finance / Invoices page.</w:t>
+              <w:t>Tested live and working: placing an order on the website through to it appearing in Jon’s app; opening and closing delivery days; moving an order when a day is taken off; product photos; and the dashboard. The remaining items below are next to build and test.</w:t>
             </w:r>
           </w:p>
         </w:tc>
@@ -912,7 +907,7 @@
                 <w:color w:val="1A1A1A"/>
                 <w:sz w:val="18"/>
               </w:rPr>
-              <w:t>The following are built and designed but need their external service connections completed: Twilio SMS (order reminders + VIP texts), EmailJS (invoice send + order confirmation emails), Google Maps route API (live optimised delivery route), customer accounts on the website (Supabase Auth sign-in), Log Order saving to Supabase, invoice creation from orders, and the revenue chart replacing its placeholder bars with real figures.</w:t>
+              <w:t>Built and designed, awaiting their next steps: customer accounts and one-tap reorder on the website; invoice save and PDF; EmailJS (order confirmation and invoice emails); Claude AI (order parsing and message drafting); Google Maps (live optimised route); Twilio (SMS reminders and VIP texts); and card payment as a later phase. The revenue chart on the dashboard is still a placeholder.</w:t>
             </w:r>
           </w:p>
         </w:tc>
@@ -1522,7 +1517,7 @@
                 <w:color w:val="1A1A1A"/>
                 <w:sz w:val="18"/>
               </w:rPr>
-              <w:t>Coming next — the form is designed and the database is ready. Connecting it up as the next step.</w:t>
+              <w:t>Live. Customers pick products, choose from this week’s available delivery days, leave their details and place the order — it lands in Jon’s app instantly. Pay-on-delivery for now; card payment is a later phase.</w:t>
             </w:r>
           </w:p>
         </w:tc>
@@ -1608,7 +1603,7 @@
                 <w:color w:val="1A1A1A"/>
                 <w:sz w:val="18"/>
               </w:rPr>
-              <w:t>Guest checkout is ready. Account sign-up and one-tap reordering follow once EmailJS is connected for confirmation emails.</w:t>
+              <w:t>Guest checkout is live and working. Optional account sign-up and one-tap reordering are the next website feature, with a security tightening going in alongside them.</w:t>
             </w:r>
           </w:p>
         </w:tc>
@@ -2132,7 +2127,7 @@
                 <w:color w:val="1A1A1A"/>
                 <w:sz w:val="18"/>
               </w:rPr>
-              <w:t>Monday, Wednesday and Thursday tabs — live order counts, dynamic pick list, Google Maps route link.</w:t>
+              <w:t>A tab for every delivery day Jon has open — live order counts, dynamic pick list and route link. Driven by the new Schedule page, so it always follows whatever days he’s running.</w:t>
             </w:r>
           </w:p>
         </w:tc>
@@ -2884,7 +2879,7 @@
                 <w:color w:val="1A1A1A"/>
                 <w:sz w:val="20"/>
               </w:rPr>
-              <w:t>Finish end-to-end testing</w:t>
+              <w:t>Customer accounts &amp; reorder</w:t>
             </w:r>
           </w:p>
           <w:p>
@@ -2898,7 +2893,7 @@
                 <w:color w:val="888888"/>
                 <w:sz w:val="18"/>
               </w:rPr>
-              <w:t>Once both domains are fully live and I've tested the admin app end-to-end, I'll get your login invite over and walk you through the system.</w:t>
+              <w:t>Sign-in on the website so returning customers can reorder their usual in one tap. A security tightening goes in alongside this so accounts stay properly separated.</w:t>
             </w:r>
           </w:p>
         </w:tc>
@@ -2989,7 +2984,7 @@
                 <w:color w:val="1A1A1A"/>
                 <w:sz w:val="20"/>
               </w:rPr>
-              <w:t>Online order form</w:t>
+              <w:t>Invoices — save &amp; PDF</w:t>
             </w:r>
           </w:p>
           <w:p>
@@ -3003,7 +2998,7 @@
                 <w:color w:val="888888"/>
                 <w:sz w:val="18"/>
               </w:rPr>
-              <w:t>Connects the order form on the website to the database. Customers place an order, it lands straight in Jon’s delivery run — no message needed.</w:t>
+              <w:t>Save invoices to the database and generate a proper PDF — a receipt for home customers, an invoice for trade — ready to send.</w:t>
             </w:r>
           </w:p>
         </w:tc>
@@ -3094,7 +3089,7 @@
                 <w:color w:val="1A1A1A"/>
                 <w:sz w:val="20"/>
               </w:rPr>
-              <w:t>EmailJS — invoices &amp; order confirmations</w:t>
+              <w:t>EmailJS — confirmations &amp; invoices</w:t>
             </w:r>
           </w:p>
           <w:p>
@@ -3108,7 +3103,7 @@
                 <w:color w:val="888888"/>
                 <w:sz w:val="18"/>
               </w:rPr>
-              <w:t>Wires up the send buttons on invoices and triggers an order confirmation email to customers when they place an order on the website.</w:t>
+              <w:t>Order confirmation emails to customers, and one-tap invoice sending.</w:t>
             </w:r>
           </w:p>
         </w:tc>
@@ -3199,7 +3194,7 @@
                 <w:color w:val="1A1A1A"/>
                 <w:sz w:val="20"/>
               </w:rPr>
-              <w:t>Twilio — reminders &amp; VIP texts</w:t>
+              <w:t>Claude AI — order parsing &amp; drafts</w:t>
             </w:r>
           </w:p>
           <w:p>
@@ -3213,7 +3208,7 @@
                 <w:color w:val="888888"/>
                 <w:sz w:val="18"/>
               </w:rPr>
-              <w:t>Daily trade customer reminders and Christmas VIP messaging through one Twilio account. The UI and message templates are already built.</w:t>
+              <w:t>Paste a Facebook or WhatsApp message and the app pulls out the order, plus drafted customer messages in Jon’s own tone.</w:t>
             </w:r>
           </w:p>
         </w:tc>
@@ -3304,7 +3299,7 @@
                 <w:color w:val="1A1A1A"/>
                 <w:sz w:val="20"/>
               </w:rPr>
-              <w:t>Claude API — AI order parsing &amp; message drafting</w:t>
+              <w:t>Google Maps — live routes</w:t>
             </w:r>
           </w:p>
           <w:p>
@@ -3318,7 +3313,7 @@
                 <w:color w:val="888888"/>
                 <w:sz w:val="18"/>
               </w:rPr>
-              <w:t>Paste a Messenger thread and the app extracts the order automatically. AI-drafted VIP messages and customer communication templates.</w:t>
+              <w:t>Swap the simulated route for a real optimised delivery route.</w:t>
             </w:r>
           </w:p>
         </w:tc>
@@ -3409,7 +3404,7 @@
                 <w:color w:val="1A1A1A"/>
                 <w:sz w:val="20"/>
               </w:rPr>
-              <w:t>Google Maps API</w:t>
+              <w:t>Twilio &amp; card payments</w:t>
             </w:r>
           </w:p>
           <w:p>
@@ -3423,7 +3418,7 @@
                 <w:color w:val="888888"/>
                 <w:sz w:val="18"/>
               </w:rPr>
-              <w:t>Swaps the simulated route for a real optimised delivery route. 10-minute setup — I'll handle this.</w:t>
+              <w:t>SMS reminders and VIP texts, then online card payment as a later phase.</w:t>
             </w:r>
           </w:p>
         </w:tc>

</xml_diff>

<commit_message>
Fix VIP link + renderInvoices guard; update build summaries (Session 6)
</commit_message>
<xml_diff>
--- a/docs/client-facing/JG-Foods-Build-Summary.docx
+++ b/docs/client-facing/JG-Foods-Build-Summary.docx
@@ -82,6 +82,239 @@
         </w:tc>
       </w:tr>
     </w:tbl>
+    <w:tbl>
+      <w:tblPr>
+        <w:tblLook w:firstColumn="1" w:firstRow="1" w:lastColumn="0" w:lastRow="0" w:noHBand="0" w:noVBand="1" w:val="04A0"/>
+        <w:tblW w:w="9412" w:type="dxa"/>
+        <w:tblBorders>
+          <w:top w:val="none"/>
+          <w:left w:val="none"/>
+          <w:bottom w:val="none"/>
+          <w:right w:val="none"/>
+          <w:insideH w:val="none"/>
+          <w:insideV w:val="none"/>
+        </w:tblBorders>
+      </w:tblPr>
+      <w:tblGrid>
+        <w:gridCol w:w="10800"/>
+      </w:tblGrid>
+      <w:tr>
+        <w:tc>
+          <w:tcPr>
+            <w:tcW w:w="9412" w:type="dxa"/>
+            <w:shd w:val="clear" w:color="auto" w:fill="F6F1E7"/>
+            <w:tcBorders>
+              <w:top w:val="none" w:sz="0" w:space="0" w:color="auto"/>
+              <w:left w:val="single" w:sz="18" w:space="0" w:color="15A36A"/>
+              <w:bottom w:val="none" w:sz="0" w:space="0" w:color="auto"/>
+              <w:right w:val="none" w:sz="0" w:space="0" w:color="auto"/>
+              <w:insideH w:val="none" w:sz="0" w:space="0" w:color="auto"/>
+              <w:insideV w:val="none" w:sz="0" w:space="0" w:color="auto"/>
+            </w:tcBorders>
+            <w:tcMar>
+              <w:top w:w="180" w:type="dxa"/>
+              <w:start w:w="220" w:type="dxa"/>
+              <w:bottom w:w="200" w:type="dxa"/>
+              <w:end w:w="200" w:type="dxa"/>
+            </w:tcMar>
+          </w:tcPr>
+          <w:p>
+            <w:pPr>
+              <w:spacing w:before="0" w:after="6"/>
+            </w:pPr>
+            <w:r>
+              <w:rPr>
+                <w:rFonts w:ascii="Calibri" w:hAnsi="Calibri"/>
+                <w:b/>
+                <w:color w:val="15A36A"/>
+                <w:sz w:val="18"/>
+              </w:rPr>
+              <w:t>SESSION 6 · 15 JUNE 2026</w:t>
+            </w:r>
+          </w:p>
+          <w:p>
+            <w:pPr>
+              <w:spacing w:before="0" w:after="10"/>
+            </w:pPr>
+            <w:r>
+              <w:rPr>
+                <w:rFonts w:ascii="Calibri" w:hAnsi="Calibri"/>
+                <w:b/>
+                <w:color w:val="0D1726"/>
+                <w:sz w:val="28"/>
+              </w:rPr>
+              <w:t>Social posts &amp; AI — now live</w:t>
+            </w:r>
+          </w:p>
+          <w:p>
+            <w:pPr>
+              <w:spacing w:before="0" w:after="6"/>
+            </w:pPr>
+            <w:r>
+              <w:rPr>
+                <w:rFonts w:ascii="Calibri" w:hAnsi="Calibri"/>
+                <w:b/>
+                <w:color w:val="0D1726"/>
+                <w:sz w:val="19"/>
+              </w:rPr>
+              <w:t xml:space="preserve">New Social Posts tab — </w:t>
+            </w:r>
+            <w:r>
+              <w:rPr>
+                <w:rFonts w:ascii="Calibri" w:hAnsi="Calibri"/>
+                <w:b w:val="0"/>
+                <w:color w:val="3A3A3A"/>
+                <w:sz w:val="19"/>
+              </w:rPr>
+              <w:t>its own tab in the admin. Jon types a few rough notes and the system writes a clean, ready-to-post message.</w:t>
+            </w:r>
+          </w:p>
+          <w:p>
+            <w:pPr>
+              <w:spacing w:before="0" w:after="6"/>
+            </w:pPr>
+            <w:r>
+              <w:rPr>
+                <w:rFonts w:ascii="Calibri" w:hAnsi="Calibri"/>
+                <w:b/>
+                <w:color w:val="0D1726"/>
+                <w:sz w:val="19"/>
+              </w:rPr>
+              <w:t xml:space="preserve">One post for Facebook &amp; Instagram — </w:t>
+            </w:r>
+            <w:r>
+              <w:rPr>
+                <w:rFonts w:ascii="Calibri" w:hAnsi="Calibri"/>
+                <w:b w:val="0"/>
+                <w:color w:val="3A3A3A"/>
+                <w:sz w:val="19"/>
+              </w:rPr>
+              <w:t>write once and get a single post that works on both platforms, with copy and open buttons.</w:t>
+            </w:r>
+          </w:p>
+          <w:p>
+            <w:pPr>
+              <w:spacing w:before="0" w:after="6"/>
+            </w:pPr>
+            <w:r>
+              <w:rPr>
+                <w:rFonts w:ascii="Calibri" w:hAnsi="Calibri"/>
+                <w:b/>
+                <w:color w:val="0D1726"/>
+                <w:sz w:val="19"/>
+              </w:rPr>
+              <w:t xml:space="preserve">Pulls in the week’s availability — </w:t>
+            </w:r>
+            <w:r>
+              <w:rPr>
+                <w:rFonts w:ascii="Calibri" w:hAnsi="Calibri"/>
+                <w:b w:val="0"/>
+                <w:color w:val="3A3A3A"/>
+                <w:sz w:val="19"/>
+              </w:rPr>
+              <w:t>tick a box and this week’s live products and prices are added automatically.</w:t>
+            </w:r>
+          </w:p>
+          <w:p>
+            <w:pPr>
+              <w:spacing w:before="0" w:after="6"/>
+            </w:pPr>
+            <w:r>
+              <w:rPr>
+                <w:rFonts w:ascii="Calibri" w:hAnsi="Calibri"/>
+                <w:b/>
+                <w:color w:val="0D1726"/>
+                <w:sz w:val="19"/>
+              </w:rPr>
+              <w:t xml:space="preserve">Written by AI in Jon’s voice — </w:t>
+            </w:r>
+            <w:r>
+              <w:rPr>
+                <w:rFonts w:ascii="Calibri" w:hAnsi="Calibri"/>
+                <w:b w:val="0"/>
+                <w:color w:val="3A3A3A"/>
+                <w:sz w:val="19"/>
+              </w:rPr>
+              <w:t>the first live AI feature. His saved call-to-action, sign-off and hashtags go on every post, and it learns from the posts he keeps.</w:t>
+            </w:r>
+          </w:p>
+          <w:p>
+            <w:pPr>
+              <w:spacing w:before="0" w:after="6"/>
+            </w:pPr>
+            <w:r>
+              <w:rPr>
+                <w:rFonts w:ascii="Calibri" w:hAnsi="Calibri"/>
+                <w:b/>
+                <w:color w:val="0D1726"/>
+                <w:sz w:val="19"/>
+              </w:rPr>
+              <w:t xml:space="preserve">Schedule in your own time — </w:t>
+            </w:r>
+            <w:r>
+              <w:rPr>
+                <w:rFonts w:ascii="Calibri" w:hAnsi="Calibri"/>
+                <w:b w:val="0"/>
+                <w:color w:val="3A3A3A"/>
+                <w:sz w:val="19"/>
+              </w:rPr>
+              <w:t>copy the finished post and schedule it in Meta Business Suite — write tonight, set it live at 8am Wednesday.</w:t>
+            </w:r>
+          </w:p>
+          <w:p>
+            <w:pPr>
+              <w:spacing w:before="0" w:after="6"/>
+            </w:pPr>
+            <w:r>
+              <w:rPr>
+                <w:rFonts w:ascii="Calibri" w:hAnsi="Calibri"/>
+                <w:b/>
+                <w:color w:val="0D1726"/>
+                <w:sz w:val="19"/>
+              </w:rPr>
+              <w:t xml:space="preserve">Full live website test — </w:t>
+            </w:r>
+            <w:r>
+              <w:rPr>
+                <w:rFonts w:ascii="Calibri" w:hAnsi="Calibri"/>
+                <w:b w:val="0"/>
+                <w:color w:val="3A3A3A"/>
+                <w:sz w:val="19"/>
+              </w:rPr>
+              <w:t>tested the customer site end to end — products, basket, delivery picker and a real order through to confirmation.</w:t>
+            </w:r>
+          </w:p>
+          <w:p>
+            <w:pPr>
+              <w:spacing w:before="0" w:after="6"/>
+            </w:pPr>
+            <w:r>
+              <w:rPr>
+                <w:rFonts w:ascii="Calibri" w:hAnsi="Calibri"/>
+                <w:b/>
+                <w:color w:val="0D1726"/>
+                <w:sz w:val="19"/>
+              </w:rPr>
+              <w:t xml:space="preserve">Small fixes — </w:t>
+            </w:r>
+            <w:r>
+              <w:rPr>
+                <w:rFonts w:ascii="Calibri" w:hAnsi="Calibri"/>
+                <w:b w:val="0"/>
+                <w:color w:val="3A3A3A"/>
+                <w:sz w:val="19"/>
+              </w:rPr>
+              <w:t>corrected the Christmas VIP message link to the live address and fixed a minor Invoices page error.</w:t>
+            </w:r>
+          </w:p>
+        </w:tc>
+      </w:tr>
+    </w:tbl>
+    <w:p>
+      <w:pPr>
+        <w:spacing w:before="0" w:after="80"/>
+      </w:pPr>
+    </w:p>
     <w:tbl>
       <w:tblPr>
         <w:tblLook w:firstColumn="1" w:firstRow="1" w:lastColumn="0" w:lastRow="0" w:noHBand="0" w:noVBand="1" w:val="04A0"/>

</xml_diff>

<commit_message>
Auto-invoice on order + WhatsApp/email send; fix trade customer_type; commercial→trade normalise
</commit_message>
<xml_diff>
--- a/docs/client-facing/JG-Foods-Build-Summary.docx
+++ b/docs/client-facing/JG-Foods-Build-Summary.docx
@@ -102,239 +102,6 @@
         <w:tc>
           <w:tcPr>
             <w:tcW w:w="9412" w:type="dxa"/>
-            <w:shd w:val="clear" w:color="auto" w:fill="F6F1E7"/>
-            <w:tcBorders>
-              <w:top w:val="none" w:sz="0" w:space="0" w:color="auto"/>
-              <w:left w:val="single" w:sz="18" w:space="0" w:color="15A36A"/>
-              <w:bottom w:val="none" w:sz="0" w:space="0" w:color="auto"/>
-              <w:right w:val="none" w:sz="0" w:space="0" w:color="auto"/>
-              <w:insideH w:val="none" w:sz="0" w:space="0" w:color="auto"/>
-              <w:insideV w:val="none" w:sz="0" w:space="0" w:color="auto"/>
-            </w:tcBorders>
-            <w:tcMar>
-              <w:top w:w="180" w:type="dxa"/>
-              <w:start w:w="220" w:type="dxa"/>
-              <w:bottom w:w="200" w:type="dxa"/>
-              <w:end w:w="200" w:type="dxa"/>
-            </w:tcMar>
-          </w:tcPr>
-          <w:p>
-            <w:pPr>
-              <w:spacing w:before="0" w:after="6"/>
-            </w:pPr>
-            <w:r>
-              <w:rPr>
-                <w:rFonts w:ascii="Calibri" w:hAnsi="Calibri"/>
-                <w:b/>
-                <w:color w:val="15A36A"/>
-                <w:sz w:val="18"/>
-              </w:rPr>
-              <w:t>SESSION 6 · 15 JUNE 2026</w:t>
-            </w:r>
-          </w:p>
-          <w:p>
-            <w:pPr>
-              <w:spacing w:before="0" w:after="10"/>
-            </w:pPr>
-            <w:r>
-              <w:rPr>
-                <w:rFonts w:ascii="Calibri" w:hAnsi="Calibri"/>
-                <w:b/>
-                <w:color w:val="0D1726"/>
-                <w:sz w:val="28"/>
-              </w:rPr>
-              <w:t>Social posts &amp; AI — now live</w:t>
-            </w:r>
-          </w:p>
-          <w:p>
-            <w:pPr>
-              <w:spacing w:before="0" w:after="6"/>
-            </w:pPr>
-            <w:r>
-              <w:rPr>
-                <w:rFonts w:ascii="Calibri" w:hAnsi="Calibri"/>
-                <w:b/>
-                <w:color w:val="0D1726"/>
-                <w:sz w:val="19"/>
-              </w:rPr>
-              <w:t xml:space="preserve">New Social Posts tab — </w:t>
-            </w:r>
-            <w:r>
-              <w:rPr>
-                <w:rFonts w:ascii="Calibri" w:hAnsi="Calibri"/>
-                <w:b w:val="0"/>
-                <w:color w:val="3A3A3A"/>
-                <w:sz w:val="19"/>
-              </w:rPr>
-              <w:t>its own tab in the admin. Jon types a few rough notes and the system writes a clean, ready-to-post message.</w:t>
-            </w:r>
-          </w:p>
-          <w:p>
-            <w:pPr>
-              <w:spacing w:before="0" w:after="6"/>
-            </w:pPr>
-            <w:r>
-              <w:rPr>
-                <w:rFonts w:ascii="Calibri" w:hAnsi="Calibri"/>
-                <w:b/>
-                <w:color w:val="0D1726"/>
-                <w:sz w:val="19"/>
-              </w:rPr>
-              <w:t xml:space="preserve">One post for Facebook &amp; Instagram — </w:t>
-            </w:r>
-            <w:r>
-              <w:rPr>
-                <w:rFonts w:ascii="Calibri" w:hAnsi="Calibri"/>
-                <w:b w:val="0"/>
-                <w:color w:val="3A3A3A"/>
-                <w:sz w:val="19"/>
-              </w:rPr>
-              <w:t>write once and get a single post that works on both platforms, with copy and open buttons.</w:t>
-            </w:r>
-          </w:p>
-          <w:p>
-            <w:pPr>
-              <w:spacing w:before="0" w:after="6"/>
-            </w:pPr>
-            <w:r>
-              <w:rPr>
-                <w:rFonts w:ascii="Calibri" w:hAnsi="Calibri"/>
-                <w:b/>
-                <w:color w:val="0D1726"/>
-                <w:sz w:val="19"/>
-              </w:rPr>
-              <w:t xml:space="preserve">Pulls in the week’s availability — </w:t>
-            </w:r>
-            <w:r>
-              <w:rPr>
-                <w:rFonts w:ascii="Calibri" w:hAnsi="Calibri"/>
-                <w:b w:val="0"/>
-                <w:color w:val="3A3A3A"/>
-                <w:sz w:val="19"/>
-              </w:rPr>
-              <w:t>tick a box and this week’s live products and prices are added automatically.</w:t>
-            </w:r>
-          </w:p>
-          <w:p>
-            <w:pPr>
-              <w:spacing w:before="0" w:after="6"/>
-            </w:pPr>
-            <w:r>
-              <w:rPr>
-                <w:rFonts w:ascii="Calibri" w:hAnsi="Calibri"/>
-                <w:b/>
-                <w:color w:val="0D1726"/>
-                <w:sz w:val="19"/>
-              </w:rPr>
-              <w:t xml:space="preserve">Written by AI in Jon’s voice — </w:t>
-            </w:r>
-            <w:r>
-              <w:rPr>
-                <w:rFonts w:ascii="Calibri" w:hAnsi="Calibri"/>
-                <w:b w:val="0"/>
-                <w:color w:val="3A3A3A"/>
-                <w:sz w:val="19"/>
-              </w:rPr>
-              <w:t>the first live AI feature. His saved call-to-action, sign-off and hashtags go on every post, and it learns from the posts he keeps.</w:t>
-            </w:r>
-          </w:p>
-          <w:p>
-            <w:pPr>
-              <w:spacing w:before="0" w:after="6"/>
-            </w:pPr>
-            <w:r>
-              <w:rPr>
-                <w:rFonts w:ascii="Calibri" w:hAnsi="Calibri"/>
-                <w:b/>
-                <w:color w:val="0D1726"/>
-                <w:sz w:val="19"/>
-              </w:rPr>
-              <w:t xml:space="preserve">Schedule in your own time — </w:t>
-            </w:r>
-            <w:r>
-              <w:rPr>
-                <w:rFonts w:ascii="Calibri" w:hAnsi="Calibri"/>
-                <w:b w:val="0"/>
-                <w:color w:val="3A3A3A"/>
-                <w:sz w:val="19"/>
-              </w:rPr>
-              <w:t>copy the finished post and schedule it in Meta Business Suite — write tonight, set it live at 8am Wednesday.</w:t>
-            </w:r>
-          </w:p>
-          <w:p>
-            <w:pPr>
-              <w:spacing w:before="0" w:after="6"/>
-            </w:pPr>
-            <w:r>
-              <w:rPr>
-                <w:rFonts w:ascii="Calibri" w:hAnsi="Calibri"/>
-                <w:b/>
-                <w:color w:val="0D1726"/>
-                <w:sz w:val="19"/>
-              </w:rPr>
-              <w:t xml:space="preserve">Full live website test — </w:t>
-            </w:r>
-            <w:r>
-              <w:rPr>
-                <w:rFonts w:ascii="Calibri" w:hAnsi="Calibri"/>
-                <w:b w:val="0"/>
-                <w:color w:val="3A3A3A"/>
-                <w:sz w:val="19"/>
-              </w:rPr>
-              <w:t>tested the customer site end to end — products, basket, delivery picker and a real order through to confirmation.</w:t>
-            </w:r>
-          </w:p>
-          <w:p>
-            <w:pPr>
-              <w:spacing w:before="0" w:after="6"/>
-            </w:pPr>
-            <w:r>
-              <w:rPr>
-                <w:rFonts w:ascii="Calibri" w:hAnsi="Calibri"/>
-                <w:b/>
-                <w:color w:val="0D1726"/>
-                <w:sz w:val="19"/>
-              </w:rPr>
-              <w:t xml:space="preserve">Small fixes — </w:t>
-            </w:r>
-            <w:r>
-              <w:rPr>
-                <w:rFonts w:ascii="Calibri" w:hAnsi="Calibri"/>
-                <w:b w:val="0"/>
-                <w:color w:val="3A3A3A"/>
-                <w:sz w:val="19"/>
-              </w:rPr>
-              <w:t>corrected the Christmas VIP message link to the live address and fixed a minor Invoices page error.</w:t>
-            </w:r>
-          </w:p>
-        </w:tc>
-      </w:tr>
-    </w:tbl>
-    <w:p>
-      <w:pPr>
-        <w:spacing w:before="0" w:after="80"/>
-      </w:pPr>
-    </w:p>
-    <w:tbl>
-      <w:tblPr>
-        <w:tblLook w:firstColumn="1" w:firstRow="1" w:lastColumn="0" w:lastRow="0" w:noHBand="0" w:noVBand="1" w:val="04A0"/>
-        <w:tblW w:w="9412" w:type="dxa"/>
-        <w:tblBorders>
-          <w:top w:val="none"/>
-          <w:left w:val="none"/>
-          <w:bottom w:val="none"/>
-          <w:right w:val="none"/>
-          <w:insideH w:val="none"/>
-          <w:insideV w:val="none"/>
-        </w:tblBorders>
-      </w:tblPr>
-      <w:tblGrid>
-        <w:gridCol w:w="10800"/>
-      </w:tblGrid>
-      <w:tr>
-        <w:tc>
-          <w:tcPr>
-            <w:tcW w:w="9412" w:type="dxa"/>
             <w:shd w:val="clear" w:color="auto" w:fill="111F33"/>
             <w:tcBorders>
               <w:top w:val="none" w:sz="0" w:space="0" w:color="auto"/>
@@ -362,7 +129,7 @@
                 <w:color w:val="15A36A"/>
                 <w:sz w:val="16"/>
               </w:rPr>
-              <w:t>BUILD SUMMARY  ·  SESSION 5  ·  12 JUNE 2026</w:t>
+              <w:t>BUILD SUMMARY  ·  SESSION 6  ·  15 JUNE 2026</w:t>
             </w:r>
           </w:p>
           <w:p>
@@ -376,7 +143,7 @@
                 <w:color w:val="FFFFFF"/>
                 <w:sz w:val="40"/>
               </w:rPr>
-              <w:t>JG Foods — online ordering is live, and Jon’s in control of his delivery days.</w:t>
+              <w:t>JG Foods — Jon’s social posts now write themselves.</w:t>
             </w:r>
           </w:p>
           <w:p>
@@ -390,7 +157,7 @@
                 <w:color w:val="CCCCCC"/>
                 <w:sz w:val="22"/>
               </w:rPr>
-              <w:t>Customers can now order on the website and it lands straight in Jon’s app, tested start to finish on the live site. Jon can take days off or add one-off delivery days himself, the website keeps itself in step, and a security gap around customer data was found and closed.</w:t>
+              <w:t>Session 6 adds a Social Posts tab to Jon’s app that turns a few quick notes into a finished Facebook and Instagram post — pulling in the week’s availability and keeping his own voice. It’s the first AI feature live on the system. The customer website was also tested end to end on the live site, and a couple of small issues were fixed.</w:t>
             </w:r>
           </w:p>
           <w:p>
@@ -455,6 +222,11 @@
         <w:spacing w:before="0" w:after="60"/>
       </w:pPr>
     </w:p>
+    <w:p>
+      <w:pPr>
+        <w:spacing w:before="0" w:after="80"/>
+      </w:pPr>
+    </w:p>
     <w:tbl>
       <w:tblPr>
         <w:tblLook w:firstColumn="1" w:firstRow="1" w:lastColumn="0" w:lastRow="0" w:noHBand="0" w:noVBand="1" w:val="04A0"/>
@@ -503,7 +275,7 @@
                 <w:color w:val="FFFFFF"/>
                 <w:sz w:val="18"/>
               </w:rPr>
-              <w:t>WHAT WE DID THIS SESSION</w:t>
+              <w:t>THIS SESSION  ·  15 JUNE</w:t>
             </w:r>
           </w:p>
         </w:tc>
@@ -541,7 +313,703 @@
           <w:color w:val="1A1A1A"/>
           <w:sz w:val="22"/>
         </w:rPr>
-        <w:t>Connecting the dots — data, images, and the website</w:t>
+        <w:t>Social Posts &amp; AI — now live</w:t>
+      </w:r>
+    </w:p>
+    <w:tbl>
+      <w:tblPr>
+        <w:tblLook w:firstColumn="1" w:firstRow="1" w:lastColumn="0" w:lastRow="0" w:noHBand="0" w:noVBand="1" w:val="04A0"/>
+        <w:tblW w:w="9412" w:type="dxa"/>
+        <w:tblBorders>
+          <w:top w:val="none"/>
+          <w:left w:val="none"/>
+          <w:bottom w:val="none"/>
+          <w:right w:val="none"/>
+          <w:insideH w:val="none"/>
+          <w:insideV w:val="none"/>
+        </w:tblBorders>
+      </w:tblPr>
+      <w:tblGrid>
+        <w:gridCol w:w="5400"/>
+        <w:gridCol w:w="5400"/>
+      </w:tblGrid>
+      <w:tr>
+        <w:tc>
+          <w:tcPr>
+            <w:tcW w:w="2200" w:type="dxa"/>
+            <w:tcBorders>
+              <w:top w:val="single" w:sz="1" w:color="E0E0E0"/>
+              <w:bottom w:val="single" w:sz="1" w:color="E0E0E0"/>
+              <w:left w:val="none"/>
+              <w:right w:val="none"/>
+              <w:insideH w:val="none"/>
+              <w:insideV w:val="none"/>
+            </w:tcBorders>
+            <w:tcMar>
+              <w:top w:w="80" w:type="dxa"/>
+              <w:start w:w="200" w:type="dxa"/>
+              <w:bottom w:w="80" w:type="dxa"/>
+              <w:end w:w="120" w:type="dxa"/>
+            </w:tcMar>
+          </w:tcPr>
+          <w:p>
+            <w:pPr>
+              <w:spacing w:before="0" w:after="0"/>
+            </w:pPr>
+            <w:r>
+              <w:rPr>
+                <w:rFonts w:ascii="Calibri" w:hAnsi="Calibri"/>
+                <w:b/>
+                <w:color w:val="1A1A1A"/>
+                <w:sz w:val="18"/>
+              </w:rPr>
+              <w:t>New Social Posts tab</w:t>
+            </w:r>
+          </w:p>
+        </w:tc>
+        <w:tc>
+          <w:tcPr>
+            <w:tcW w:w="7212" w:type="dxa"/>
+            <w:tcBorders>
+              <w:top w:val="single" w:sz="1" w:color="E0E0E0"/>
+              <w:bottom w:val="single" w:sz="1" w:color="E0E0E0"/>
+              <w:left w:val="none"/>
+              <w:right w:val="none"/>
+              <w:insideH w:val="none"/>
+              <w:insideV w:val="none"/>
+            </w:tcBorders>
+            <w:tcMar>
+              <w:top w:w="80" w:type="dxa"/>
+              <w:start w:w="120" w:type="dxa"/>
+              <w:bottom w:w="80" w:type="dxa"/>
+              <w:end w:w="200" w:type="dxa"/>
+            </w:tcMar>
+          </w:tcPr>
+          <w:p>
+            <w:pPr>
+              <w:spacing w:before="0" w:after="0"/>
+            </w:pPr>
+            <w:r>
+              <w:rPr>
+                <w:rFonts w:ascii="Calibri" w:hAnsi="Calibri"/>
+                <w:b w:val="0"/>
+                <w:color w:val="1A1A1A"/>
+                <w:sz w:val="18"/>
+              </w:rPr>
+              <w:t>Its own tab in the app. Jon types a few rough notes — “diary’s open for Monday and Thursday this week” — and the system writes a clean, ready-to-post message.</w:t>
+            </w:r>
+          </w:p>
+        </w:tc>
+      </w:tr>
+    </w:tbl>
+    <w:tbl>
+      <w:tblPr>
+        <w:tblLook w:firstColumn="1" w:firstRow="1" w:lastColumn="0" w:lastRow="0" w:noHBand="0" w:noVBand="1" w:val="04A0"/>
+        <w:tblW w:w="9412" w:type="dxa"/>
+        <w:tblBorders>
+          <w:top w:val="none"/>
+          <w:left w:val="none"/>
+          <w:bottom w:val="none"/>
+          <w:right w:val="none"/>
+          <w:insideH w:val="none"/>
+          <w:insideV w:val="none"/>
+        </w:tblBorders>
+      </w:tblPr>
+      <w:tblGrid>
+        <w:gridCol w:w="5400"/>
+        <w:gridCol w:w="5400"/>
+      </w:tblGrid>
+      <w:tr>
+        <w:tc>
+          <w:tcPr>
+            <w:tcW w:w="2200" w:type="dxa"/>
+            <w:tcBorders>
+              <w:top w:val="single" w:sz="1" w:color="E0E0E0"/>
+              <w:bottom w:val="single" w:sz="1" w:color="E0E0E0"/>
+              <w:left w:val="none"/>
+              <w:right w:val="none"/>
+              <w:insideH w:val="none"/>
+              <w:insideV w:val="none"/>
+            </w:tcBorders>
+            <w:tcMar>
+              <w:top w:w="80" w:type="dxa"/>
+              <w:start w:w="200" w:type="dxa"/>
+              <w:bottom w:w="80" w:type="dxa"/>
+              <w:end w:w="120" w:type="dxa"/>
+            </w:tcMar>
+          </w:tcPr>
+          <w:p>
+            <w:pPr>
+              <w:spacing w:before="0" w:after="0"/>
+            </w:pPr>
+            <w:r>
+              <w:rPr>
+                <w:rFonts w:ascii="Calibri" w:hAnsi="Calibri"/>
+                <w:b/>
+                <w:color w:val="1A1A1A"/>
+                <w:sz w:val="18"/>
+              </w:rPr>
+              <w:t>One post for Facebook &amp; Instagram</w:t>
+            </w:r>
+          </w:p>
+        </w:tc>
+        <w:tc>
+          <w:tcPr>
+            <w:tcW w:w="7212" w:type="dxa"/>
+            <w:tcBorders>
+              <w:top w:val="single" w:sz="1" w:color="E0E0E0"/>
+              <w:bottom w:val="single" w:sz="1" w:color="E0E0E0"/>
+              <w:left w:val="none"/>
+              <w:right w:val="none"/>
+              <w:insideH w:val="none"/>
+              <w:insideV w:val="none"/>
+            </w:tcBorders>
+            <w:tcMar>
+              <w:top w:w="80" w:type="dxa"/>
+              <w:start w:w="120" w:type="dxa"/>
+              <w:bottom w:w="80" w:type="dxa"/>
+              <w:end w:w="200" w:type="dxa"/>
+            </w:tcMar>
+          </w:tcPr>
+          <w:p>
+            <w:pPr>
+              <w:spacing w:before="0" w:after="0"/>
+            </w:pPr>
+            <w:r>
+              <w:rPr>
+                <w:rFonts w:ascii="Calibri" w:hAnsi="Calibri"/>
+                <w:b w:val="0"/>
+                <w:color w:val="1A1A1A"/>
+                <w:sz w:val="18"/>
+              </w:rPr>
+              <w:t>Write once and get a single post that works on both platforms, with copy buttons and direct links to each.</w:t>
+            </w:r>
+          </w:p>
+        </w:tc>
+      </w:tr>
+    </w:tbl>
+    <w:tbl>
+      <w:tblPr>
+        <w:tblLook w:firstColumn="1" w:firstRow="1" w:lastColumn="0" w:lastRow="0" w:noHBand="0" w:noVBand="1" w:val="04A0"/>
+        <w:tblW w:w="9412" w:type="dxa"/>
+        <w:tblBorders>
+          <w:top w:val="none"/>
+          <w:left w:val="none"/>
+          <w:bottom w:val="none"/>
+          <w:right w:val="none"/>
+          <w:insideH w:val="none"/>
+          <w:insideV w:val="none"/>
+        </w:tblBorders>
+      </w:tblPr>
+      <w:tblGrid>
+        <w:gridCol w:w="5400"/>
+        <w:gridCol w:w="5400"/>
+      </w:tblGrid>
+      <w:tr>
+        <w:tc>
+          <w:tcPr>
+            <w:tcW w:w="2200" w:type="dxa"/>
+            <w:tcBorders>
+              <w:top w:val="single" w:sz="1" w:color="E0E0E0"/>
+              <w:bottom w:val="single" w:sz="1" w:color="E0E0E0"/>
+              <w:left w:val="none"/>
+              <w:right w:val="none"/>
+              <w:insideH w:val="none"/>
+              <w:insideV w:val="none"/>
+            </w:tcBorders>
+            <w:tcMar>
+              <w:top w:w="80" w:type="dxa"/>
+              <w:start w:w="200" w:type="dxa"/>
+              <w:bottom w:w="80" w:type="dxa"/>
+              <w:end w:w="120" w:type="dxa"/>
+            </w:tcMar>
+          </w:tcPr>
+          <w:p>
+            <w:pPr>
+              <w:spacing w:before="0" w:after="0"/>
+            </w:pPr>
+            <w:r>
+              <w:rPr>
+                <w:rFonts w:ascii="Calibri" w:hAnsi="Calibri"/>
+                <w:b/>
+                <w:color w:val="1A1A1A"/>
+                <w:sz w:val="18"/>
+              </w:rPr>
+              <w:t>This week’s availability, automatically</w:t>
+            </w:r>
+          </w:p>
+        </w:tc>
+        <w:tc>
+          <w:tcPr>
+            <w:tcW w:w="7212" w:type="dxa"/>
+            <w:tcBorders>
+              <w:top w:val="single" w:sz="1" w:color="E0E0E0"/>
+              <w:bottom w:val="single" w:sz="1" w:color="E0E0E0"/>
+              <w:left w:val="none"/>
+              <w:right w:val="none"/>
+              <w:insideH w:val="none"/>
+              <w:insideV w:val="none"/>
+            </w:tcBorders>
+            <w:tcMar>
+              <w:top w:w="80" w:type="dxa"/>
+              <w:start w:w="120" w:type="dxa"/>
+              <w:bottom w:w="80" w:type="dxa"/>
+              <w:end w:w="200" w:type="dxa"/>
+            </w:tcMar>
+          </w:tcPr>
+          <w:p>
+            <w:pPr>
+              <w:spacing w:before="0" w:after="0"/>
+            </w:pPr>
+            <w:r>
+              <w:rPr>
+                <w:rFonts w:ascii="Calibri" w:hAnsi="Calibri"/>
+                <w:b w:val="0"/>
+                <w:color w:val="1A1A1A"/>
+                <w:sz w:val="18"/>
+              </w:rPr>
+              <w:t>Tick a box and the post includes this week’s live products and prices straight from the Availability page — no retyping the list.</w:t>
+            </w:r>
+          </w:p>
+        </w:tc>
+      </w:tr>
+    </w:tbl>
+    <w:tbl>
+      <w:tblPr>
+        <w:tblLook w:firstColumn="1" w:firstRow="1" w:lastColumn="0" w:lastRow="0" w:noHBand="0" w:noVBand="1" w:val="04A0"/>
+        <w:tblW w:w="9412" w:type="dxa"/>
+        <w:tblBorders>
+          <w:top w:val="none"/>
+          <w:left w:val="none"/>
+          <w:bottom w:val="none"/>
+          <w:right w:val="none"/>
+          <w:insideH w:val="none"/>
+          <w:insideV w:val="none"/>
+        </w:tblBorders>
+      </w:tblPr>
+      <w:tblGrid>
+        <w:gridCol w:w="5400"/>
+        <w:gridCol w:w="5400"/>
+      </w:tblGrid>
+      <w:tr>
+        <w:tc>
+          <w:tcPr>
+            <w:tcW w:w="2200" w:type="dxa"/>
+            <w:tcBorders>
+              <w:top w:val="single" w:sz="1" w:color="E0E0E0"/>
+              <w:bottom w:val="single" w:sz="1" w:color="E0E0E0"/>
+              <w:left w:val="none"/>
+              <w:right w:val="none"/>
+              <w:insideH w:val="none"/>
+              <w:insideV w:val="none"/>
+            </w:tcBorders>
+            <w:tcMar>
+              <w:top w:w="80" w:type="dxa"/>
+              <w:start w:w="200" w:type="dxa"/>
+              <w:bottom w:w="80" w:type="dxa"/>
+              <w:end w:w="120" w:type="dxa"/>
+            </w:tcMar>
+          </w:tcPr>
+          <w:p>
+            <w:pPr>
+              <w:spacing w:before="0" w:after="0"/>
+            </w:pPr>
+            <w:r>
+              <w:rPr>
+                <w:rFonts w:ascii="Calibri" w:hAnsi="Calibri"/>
+                <w:b/>
+                <w:color w:val="1A1A1A"/>
+                <w:sz w:val="18"/>
+              </w:rPr>
+              <w:t>Written by AI, in Jon’s voice</w:t>
+            </w:r>
+          </w:p>
+        </w:tc>
+        <w:tc>
+          <w:tcPr>
+            <w:tcW w:w="7212" w:type="dxa"/>
+            <w:tcBorders>
+              <w:top w:val="single" w:sz="1" w:color="E0E0E0"/>
+              <w:bottom w:val="single" w:sz="1" w:color="E0E0E0"/>
+              <w:left w:val="none"/>
+              <w:right w:val="none"/>
+              <w:insideH w:val="none"/>
+              <w:insideV w:val="none"/>
+            </w:tcBorders>
+            <w:tcMar>
+              <w:top w:w="80" w:type="dxa"/>
+              <w:start w:w="120" w:type="dxa"/>
+              <w:bottom w:w="80" w:type="dxa"/>
+              <w:end w:w="200" w:type="dxa"/>
+            </w:tcMar>
+          </w:tcPr>
+          <w:p>
+            <w:pPr>
+              <w:spacing w:before="0" w:after="0"/>
+            </w:pPr>
+            <w:r>
+              <w:rPr>
+                <w:rFonts w:ascii="Calibri" w:hAnsi="Calibri"/>
+                <w:b w:val="0"/>
+                <w:color w:val="1A1A1A"/>
+                <w:sz w:val="18"/>
+              </w:rPr>
+              <w:t>The post is written by AI so it reads warmly and naturally. Jon’s saved call-to-action, sign-off and hashtags go on every post, and new posts learn from the ones he keeps. This is the first AI feature live on the system.</w:t>
+            </w:r>
+          </w:p>
+        </w:tc>
+      </w:tr>
+    </w:tbl>
+    <w:tbl>
+      <w:tblPr>
+        <w:tblLook w:firstColumn="1" w:firstRow="1" w:lastColumn="0" w:lastRow="0" w:noHBand="0" w:noVBand="1" w:val="04A0"/>
+        <w:tblW w:w="9412" w:type="dxa"/>
+        <w:tblBorders>
+          <w:top w:val="none"/>
+          <w:left w:val="none"/>
+          <w:bottom w:val="none"/>
+          <w:right w:val="none"/>
+          <w:insideH w:val="none"/>
+          <w:insideV w:val="none"/>
+        </w:tblBorders>
+      </w:tblPr>
+      <w:tblGrid>
+        <w:gridCol w:w="5400"/>
+        <w:gridCol w:w="5400"/>
+      </w:tblGrid>
+      <w:tr>
+        <w:tc>
+          <w:tcPr>
+            <w:tcW w:w="2200" w:type="dxa"/>
+            <w:tcBorders>
+              <w:top w:val="single" w:sz="1" w:color="E0E0E0"/>
+              <w:bottom w:val="single" w:sz="1" w:color="E0E0E0"/>
+              <w:left w:val="none"/>
+              <w:right w:val="none"/>
+              <w:insideH w:val="none"/>
+              <w:insideV w:val="none"/>
+            </w:tcBorders>
+            <w:tcMar>
+              <w:top w:w="80" w:type="dxa"/>
+              <w:start w:w="200" w:type="dxa"/>
+              <w:bottom w:w="80" w:type="dxa"/>
+              <w:end w:w="120" w:type="dxa"/>
+            </w:tcMar>
+          </w:tcPr>
+          <w:p>
+            <w:pPr>
+              <w:spacing w:before="0" w:after="0"/>
+            </w:pPr>
+            <w:r>
+              <w:rPr>
+                <w:rFonts w:ascii="Calibri" w:hAnsi="Calibri"/>
+                <w:b/>
+                <w:color w:val="1A1A1A"/>
+                <w:sz w:val="18"/>
+              </w:rPr>
+              <w:t>Schedule it your own way</w:t>
+            </w:r>
+          </w:p>
+        </w:tc>
+        <w:tc>
+          <w:tcPr>
+            <w:tcW w:w="7212" w:type="dxa"/>
+            <w:tcBorders>
+              <w:top w:val="single" w:sz="1" w:color="E0E0E0"/>
+              <w:bottom w:val="single" w:sz="1" w:color="E0E0E0"/>
+              <w:left w:val="none"/>
+              <w:right w:val="none"/>
+              <w:insideH w:val="none"/>
+              <w:insideV w:val="none"/>
+            </w:tcBorders>
+            <w:tcMar>
+              <w:top w:w="80" w:type="dxa"/>
+              <w:start w:w="120" w:type="dxa"/>
+              <w:bottom w:w="80" w:type="dxa"/>
+              <w:end w:w="200" w:type="dxa"/>
+            </w:tcMar>
+          </w:tcPr>
+          <w:p>
+            <w:pPr>
+              <w:spacing w:before="0" w:after="0"/>
+            </w:pPr>
+            <w:r>
+              <w:rPr>
+                <w:rFonts w:ascii="Calibri" w:hAnsi="Calibri"/>
+                <w:b w:val="0"/>
+                <w:color w:val="1A1A1A"/>
+                <w:sz w:val="18"/>
+              </w:rPr>
+              <w:t>Jon copies the finished post and schedules it himself in Meta Business Suite — write it tonight, set it live at 8am Wednesday. Simple and free.</w:t>
+            </w:r>
+          </w:p>
+        </w:tc>
+      </w:tr>
+    </w:tbl>
+    <w:tbl>
+      <w:tblPr>
+        <w:tblLook w:firstColumn="1" w:firstRow="1" w:lastColumn="0" w:lastRow="0" w:noHBand="0" w:noVBand="1" w:val="04A0"/>
+        <w:tblW w:w="9412" w:type="dxa"/>
+        <w:tblBorders>
+          <w:top w:val="none"/>
+          <w:left w:val="none"/>
+          <w:bottom w:val="none"/>
+          <w:right w:val="none"/>
+          <w:insideH w:val="none"/>
+          <w:insideV w:val="none"/>
+        </w:tblBorders>
+      </w:tblPr>
+      <w:tblGrid>
+        <w:gridCol w:w="5400"/>
+        <w:gridCol w:w="5400"/>
+      </w:tblGrid>
+      <w:tr>
+        <w:tc>
+          <w:tcPr>
+            <w:tcW w:w="2200" w:type="dxa"/>
+            <w:tcBorders>
+              <w:top w:val="single" w:sz="1" w:color="E0E0E0"/>
+              <w:bottom w:val="single" w:sz="1" w:color="E0E0E0"/>
+              <w:left w:val="none"/>
+              <w:right w:val="none"/>
+              <w:insideH w:val="none"/>
+              <w:insideV w:val="none"/>
+            </w:tcBorders>
+            <w:tcMar>
+              <w:top w:w="80" w:type="dxa"/>
+              <w:start w:w="200" w:type="dxa"/>
+              <w:bottom w:w="80" w:type="dxa"/>
+              <w:end w:w="120" w:type="dxa"/>
+            </w:tcMar>
+          </w:tcPr>
+          <w:p>
+            <w:pPr>
+              <w:spacing w:before="0" w:after="0"/>
+            </w:pPr>
+            <w:r>
+              <w:rPr>
+                <w:rFonts w:ascii="Calibri" w:hAnsi="Calibri"/>
+                <w:b/>
+                <w:color w:val="1A1A1A"/>
+                <w:sz w:val="18"/>
+              </w:rPr>
+              <w:t>Tested on the live site</w:t>
+            </w:r>
+          </w:p>
+        </w:tc>
+        <w:tc>
+          <w:tcPr>
+            <w:tcW w:w="7212" w:type="dxa"/>
+            <w:tcBorders>
+              <w:top w:val="single" w:sz="1" w:color="E0E0E0"/>
+              <w:bottom w:val="single" w:sz="1" w:color="E0E0E0"/>
+              <w:left w:val="none"/>
+              <w:right w:val="none"/>
+              <w:insideH w:val="none"/>
+              <w:insideV w:val="none"/>
+            </w:tcBorders>
+            <w:tcMar>
+              <w:top w:w="80" w:type="dxa"/>
+              <w:start w:w="120" w:type="dxa"/>
+              <w:bottom w:w="80" w:type="dxa"/>
+              <w:end w:w="200" w:type="dxa"/>
+            </w:tcMar>
+          </w:tcPr>
+          <w:p>
+            <w:pPr>
+              <w:spacing w:before="0" w:after="0"/>
+            </w:pPr>
+            <w:r>
+              <w:rPr>
+                <w:rFonts w:ascii="Calibri" w:hAnsi="Calibri"/>
+                <w:b w:val="0"/>
+                <w:color w:val="1A1A1A"/>
+                <w:sz w:val="18"/>
+              </w:rPr>
+              <w:t>Worked through the live customer site end to end — products loading, the basket, the delivery-day picker and a real order through to confirmation. All correct.</w:t>
+            </w:r>
+          </w:p>
+        </w:tc>
+      </w:tr>
+    </w:tbl>
+    <w:tbl>
+      <w:tblPr>
+        <w:tblLook w:firstColumn="1" w:firstRow="1" w:lastColumn="0" w:lastRow="0" w:noHBand="0" w:noVBand="1" w:val="04A0"/>
+        <w:tblW w:w="9412" w:type="dxa"/>
+        <w:tblBorders>
+          <w:top w:val="none"/>
+          <w:left w:val="none"/>
+          <w:bottom w:val="none"/>
+          <w:right w:val="none"/>
+          <w:insideH w:val="none"/>
+          <w:insideV w:val="none"/>
+        </w:tblBorders>
+      </w:tblPr>
+      <w:tblGrid>
+        <w:gridCol w:w="5400"/>
+        <w:gridCol w:w="5400"/>
+      </w:tblGrid>
+      <w:tr>
+        <w:tc>
+          <w:tcPr>
+            <w:tcW w:w="2200" w:type="dxa"/>
+            <w:tcBorders>
+              <w:top w:val="single" w:sz="1" w:color="E0E0E0"/>
+              <w:bottom w:val="single" w:sz="1" w:color="E0E0E0"/>
+              <w:left w:val="none"/>
+              <w:right w:val="none"/>
+              <w:insideH w:val="none"/>
+              <w:insideV w:val="none"/>
+            </w:tcBorders>
+            <w:tcMar>
+              <w:top w:w="80" w:type="dxa"/>
+              <w:start w:w="200" w:type="dxa"/>
+              <w:bottom w:w="80" w:type="dxa"/>
+              <w:end w:w="120" w:type="dxa"/>
+            </w:tcMar>
+          </w:tcPr>
+          <w:p>
+            <w:pPr>
+              <w:spacing w:before="0" w:after="0"/>
+            </w:pPr>
+            <w:r>
+              <w:rPr>
+                <w:rFonts w:ascii="Calibri" w:hAnsi="Calibri"/>
+                <w:b/>
+                <w:color w:val="1A1A1A"/>
+                <w:sz w:val="18"/>
+              </w:rPr>
+              <w:t>Two small fixes</w:t>
+            </w:r>
+          </w:p>
+        </w:tc>
+        <w:tc>
+          <w:tcPr>
+            <w:tcW w:w="7212" w:type="dxa"/>
+            <w:tcBorders>
+              <w:top w:val="single" w:sz="1" w:color="E0E0E0"/>
+              <w:bottom w:val="single" w:sz="1" w:color="E0E0E0"/>
+              <w:left w:val="none"/>
+              <w:right w:val="none"/>
+              <w:insideH w:val="none"/>
+              <w:insideV w:val="none"/>
+            </w:tcBorders>
+            <w:tcMar>
+              <w:top w:w="80" w:type="dxa"/>
+              <w:start w:w="120" w:type="dxa"/>
+              <w:bottom w:w="80" w:type="dxa"/>
+              <w:end w:w="200" w:type="dxa"/>
+            </w:tcMar>
+          </w:tcPr>
+          <w:p>
+            <w:pPr>
+              <w:spacing w:before="0" w:after="0"/>
+            </w:pPr>
+            <w:r>
+              <w:rPr>
+                <w:rFonts w:ascii="Calibri" w:hAnsi="Calibri"/>
+                <w:b w:val="0"/>
+                <w:color w:val="1A1A1A"/>
+                <w:sz w:val="18"/>
+              </w:rPr>
+              <w:t>Corrected the website link in the Christmas VIP message to the live address, and fixed a minor error on the Invoices page.</w:t>
+            </w:r>
+          </w:p>
+        </w:tc>
+      </w:tr>
+    </w:tbl>
+    <w:p>
+      <w:pPr>
+        <w:spacing w:before="0" w:after="80"/>
+      </w:pPr>
+    </w:p>
+    <w:tbl>
+      <w:tblPr>
+        <w:tblLook w:firstColumn="1" w:firstRow="1" w:lastColumn="0" w:lastRow="0" w:noHBand="0" w:noVBand="1" w:val="04A0"/>
+        <w:tblW w:w="9412" w:type="dxa"/>
+        <w:tblBorders>
+          <w:top w:val="none"/>
+          <w:left w:val="none"/>
+          <w:bottom w:val="none"/>
+          <w:right w:val="none"/>
+          <w:insideH w:val="none"/>
+          <w:insideV w:val="none"/>
+        </w:tblBorders>
+      </w:tblPr>
+      <w:tblGrid>
+        <w:gridCol w:w="5400"/>
+        <w:gridCol w:w="5400"/>
+      </w:tblGrid>
+      <w:tr>
+        <w:tc>
+          <w:tcPr>
+            <w:tcW w:w="4706" w:type="dxa"/>
+            <w:shd w:val="clear" w:color="auto" w:fill="15A36A"/>
+            <w:tcBorders>
+              <w:top w:val="none" w:sz="0" w:space="0" w:color="auto"/>
+              <w:left w:val="none" w:sz="0" w:space="0" w:color="auto"/>
+              <w:bottom w:val="none" w:sz="0" w:space="0" w:color="auto"/>
+              <w:right w:val="none" w:sz="0" w:space="0" w:color="auto"/>
+              <w:insideH w:val="none" w:sz="0" w:space="0" w:color="auto"/>
+              <w:insideV w:val="none" w:sz="0" w:space="0" w:color="auto"/>
+            </w:tcBorders>
+            <w:tcMar>
+              <w:top w:w="100" w:type="dxa"/>
+              <w:start w:w="200" w:type="dxa"/>
+              <w:bottom w:w="80" w:type="dxa"/>
+              <w:end w:w="0" w:type="dxa"/>
+            </w:tcMar>
+          </w:tcPr>
+          <w:p>
+            <w:pPr>
+              <w:spacing w:before="0" w:after="0"/>
+            </w:pPr>
+            <w:r>
+              <w:rPr>
+                <w:rFonts w:ascii="Calibri" w:hAnsi="Calibri"/>
+                <w:b/>
+                <w:color w:val="FFFFFF"/>
+                <w:sz w:val="18"/>
+              </w:rPr>
+              <w:t>PREVIOUS SESSION  ·  12 JUNE</w:t>
+            </w:r>
+          </w:p>
+        </w:tc>
+        <w:tc>
+          <w:tcPr>
+            <w:tcW w:w="4706" w:type="dxa"/>
+            <w:shd w:val="clear" w:color="auto" w:fill="15A36A"/>
+            <w:tcBorders>
+              <w:top w:val="none" w:sz="0" w:space="0" w:color="auto"/>
+              <w:left w:val="none" w:sz="0" w:space="0" w:color="auto"/>
+              <w:bottom w:val="none" w:sz="0" w:space="0" w:color="auto"/>
+              <w:right w:val="none" w:sz="0" w:space="0" w:color="auto"/>
+              <w:insideH w:val="none" w:sz="0" w:space="0" w:color="auto"/>
+              <w:insideV w:val="none" w:sz="0" w:space="0" w:color="auto"/>
+            </w:tcBorders>
+            <w:tcMar>
+              <w:top w:w="100" w:type="dxa"/>
+              <w:start w:w="0" w:type="dxa"/>
+              <w:bottom w:w="80" w:type="dxa"/>
+              <w:end w:w="0" w:type="dxa"/>
+            </w:tcMar>
+          </w:tcPr>
+          <w:p/>
+        </w:tc>
+      </w:tr>
+    </w:tbl>
+    <w:p>
+      <w:pPr>
+        <w:spacing w:before="160" w:after="80"/>
+      </w:pPr>
+      <w:r>
+        <w:rPr>
+          <w:rFonts w:ascii="Calibri" w:hAnsi="Calibri"/>
+          <w:b/>
+          <w:color w:val="1A1A1A"/>
+          <w:sz w:val="22"/>
+        </w:rPr>
+        <w:t>Online ordering &amp; control of his delivery days</w:t>
       </w:r>
     </w:p>
     <w:tbl>
@@ -2790,7 +3258,7 @@
                 <w:color w:val="1A1A1A"/>
                 <w:sz w:val="18"/>
               </w:rPr>
-              <w:t>Drafts Facebook and Instagram posts from the live product list. Ready to paste — Claude API connection coming to improve the wording.</w:t>
+              <w:t>Now written by AI and live (new this session). Jon types a note and gets a finished post for both platforms, in his voice — then schedules it in Meta Business Suite.</w:t>
             </w:r>
           </w:p>
         </w:tc>
@@ -2890,7 +3358,7 @@
                 <w:color w:val="CCCCCC"/>
                 <w:sz w:val="18"/>
               </w:rPr>
-              <w:t>· Social posts drafted automatically from the live product list when availability is saved</w:t>
+              <w:t>· Social posts now written by AI and live — type a note, get a finished Facebook &amp; Instagram post (the first AI feature switched on)</w:t>
             </w:r>
           </w:p>
           <w:p>

</xml_diff>

<commit_message>
Trade accounts + daily 5pm summary email
</commit_message>
<xml_diff>
--- a/docs/client-facing/JG-Foods-Build-Summary.docx
+++ b/docs/client-facing/JG-Foods-Build-Summary.docx
@@ -680,6 +680,59 @@
                 <w:sz w:val="18"/>
               </w:rPr>
               <w:t>Offered to Jon, his choice: a jon@jgfoodsnorthwest.com address that forwards to his Gmail and lets him reply from it — more professional on receipts and to customers. Completely free to set up; his current email is perfectly fine too.</w:t>
+            </w:r>
+          </w:p>
+        </w:tc>
+      </w:tr>
+      <w:tr>
+        <w:tc>
+          <w:tcPr>
+            <w:tcW w:w="2200" w:type="dxa"/>
+            <w:tcBorders>
+              <w:top w:val="single" w:sz="1" w:space="0" w:color="E0E0E0"/>
+              <w:bottom w:val="single" w:sz="1" w:space="0" w:color="E0E0E0"/>
+            </w:tcBorders>
+            <w:tcMar>
+              <w:top w:w="80" w:type="dxa"/>
+              <w:left w:w="200" w:type="dxa"/>
+              <w:bottom w:w="80" w:type="dxa"/>
+              <w:right w:w="120" w:type="dxa"/>
+            </w:tcMar>
+          </w:tcPr>
+          <w:p>
+            <w:r>
+              <w:rPr>
+                <w:rFonts w:ascii="Calibri" w:hAnsi="Calibri"/>
+                <w:b/>
+                <w:color w:val="1A1A1A"/>
+                <w:sz w:val="18"/>
+              </w:rPr>
+              <w:t>Website contact form</w:t>
+            </w:r>
+          </w:p>
+        </w:tc>
+        <w:tc>
+          <w:tcPr>
+            <w:tcW w:w="7212" w:type="dxa"/>
+            <w:tcBorders>
+              <w:top w:val="single" w:sz="1" w:space="0" w:color="E0E0E0"/>
+              <w:bottom w:val="single" w:sz="1" w:space="0" w:color="E0E0E0"/>
+            </w:tcBorders>
+            <w:tcMar>
+              <w:top w:w="80" w:type="dxa"/>
+              <w:left w:w="120" w:type="dxa"/>
+              <w:bottom w:w="80" w:type="dxa"/>
+              <w:right w:w="200" w:type="dxa"/>
+            </w:tcMar>
+          </w:tcPr>
+          <w:p>
+            <w:r>
+              <w:rPr>
+                <w:rFonts w:ascii="Calibri" w:hAnsi="Calibri"/>
+                <w:color w:val="1A1A1A"/>
+                <w:sz w:val="18"/>
+              </w:rPr>
+              <w:t>A "Send Jon a message" form on the website's Contact section — a visitor fills in their question and it emails Jon automatically, with a copy saved as backup. Great for people who'd rather not open their email app. Free, no extra services.</w:t>
             </w:r>
           </w:p>
         </w:tc>
@@ -3291,6 +3344,95 @@
     </w:tbl>
     <w:p>
       <w:pPr>
+        <w:spacing w:after="40"/>
+      </w:pPr>
+    </w:p>
+    <w:tbl>
+      <w:tblPr>
+        <w:tblW w:w="9412" w:type="dxa"/>
+        <w:tblLook w:val="04A0" w:firstRow="1" w:lastRow="0" w:firstColumn="1" w:lastColumn="0" w:noHBand="0" w:noVBand="1"/>
+      </w:tblPr>
+      <w:tblGrid>
+        <w:gridCol w:w="700"/>
+        <w:gridCol w:w="8712"/>
+      </w:tblGrid>
+      <w:tr>
+        <w:tc>
+          <w:tcPr>
+            <w:tcW w:w="700" w:type="dxa"/>
+            <w:tcBorders>
+              <w:top w:val="single" w:sz="4" w:space="0" w:color="15A36A"/>
+              <w:left w:val="single" w:sz="4" w:space="0" w:color="15A36A"/>
+              <w:bottom w:val="single" w:sz="4" w:space="0" w:color="15A36A"/>
+              <w:right w:val="single" w:sz="4" w:space="0" w:color="15A36A"/>
+            </w:tcBorders>
+            <w:shd w:val="clear" w:color="auto" w:fill="0D1726"/>
+            <w:tcMar>
+              <w:top w:w="80" w:type="dxa"/>
+              <w:left w:w="100" w:type="dxa"/>
+              <w:bottom w:w="80" w:type="dxa"/>
+              <w:right w:w="100" w:type="dxa"/>
+            </w:tcMar>
+          </w:tcPr>
+          <w:p>
+            <w:pPr>
+              <w:jc w:val="center"/>
+            </w:pPr>
+            <w:r>
+              <w:rPr>
+                <w:rFonts w:ascii="Calibri" w:hAnsi="Calibri"/>
+                <w:b/>
+                <w:color w:val="15A36A"/>
+                <w:sz w:val="26"/>
+              </w:rPr>
+              <w:t>7</w:t>
+            </w:r>
+          </w:p>
+        </w:tc>
+        <w:tc>
+          <w:tcPr>
+            <w:tcW w:w="8712" w:type="dxa"/>
+            <w:tcBorders>
+              <w:top w:val="single" w:sz="4" w:space="0" w:color="E8E8E8"/>
+              <w:bottom w:val="single" w:sz="4" w:space="0" w:color="E8E8E8"/>
+              <w:right w:val="single" w:sz="4" w:space="0" w:color="E8E8E8"/>
+            </w:tcBorders>
+            <w:tcMar>
+              <w:top w:w="80" w:type="dxa"/>
+              <w:left w:w="160" w:type="dxa"/>
+              <w:bottom w:w="80" w:type="dxa"/>
+              <w:right w:w="160" w:type="dxa"/>
+            </w:tcMar>
+          </w:tcPr>
+          <w:p>
+            <w:pPr>
+              <w:spacing w:after="4"/>
+            </w:pPr>
+            <w:r>
+              <w:rPr>
+                <w:rFonts w:ascii="Calibri" w:hAnsi="Calibri"/>
+                <w:b/>
+                <w:color w:val="1A1A1A"/>
+                <w:sz w:val="20"/>
+              </w:rPr>
+              <w:t>Get JG Foods on Google</w:t>
+            </w:r>
+          </w:p>
+          <w:p>
+            <w:r>
+              <w:rPr>
+                <w:rFonts w:ascii="Calibri" w:hAnsi="Calibri"/>
+                <w:color w:val="888888"/>
+                <w:sz w:val="18"/>
+              </w:rPr>
+              <w:t>Set up a free Google Business Profile so JG Foods appears on the map and in local searches for a butcher or meat delivery. As a mobile business the address can stay private, listing the delivery areas instead. Jon to confirm a registration address (shown or hidden), the towns he covers, a public phone number and rough hours; Phil then gets it live on Google Maps and Search.</w:t>
+            </w:r>
+          </w:p>
+        </w:tc>
+      </w:tr>
+    </w:tbl>
+    <w:p>
+      <w:pPr>
         <w:spacing w:after="80"/>
       </w:pPr>
     </w:p>

</xml_diff>